<commit_message>
Increment SampleNumber in SAmpleInfo
Use arrow UP and DOWN instead of + or - to increment or decrement the
sample number
</commit_message>
<xml_diff>
--- a/Help.docx
+++ b/Help.docx
@@ -89,18 +89,16 @@
     </w:p>
     <w:p>
       <w:r>
-        <w:t xml:space="preserve">+/- </w:t>
-      </w:r>
-      <w:proofErr w:type="gramStart"/>
-      <w:r>
-        <w:t>everywhere</w:t>
-      </w:r>
-      <w:proofErr w:type="gramEnd"/>
-      <w:r>
-        <w:t xml:space="preserve"> = </w:t>
+        <w:t>Up/DOWN</w:t>
       </w:r>
       <w:bookmarkStart w:id="0" w:name="_GoBack"/>
       <w:bookmarkEnd w:id="0"/>
+      <w:r>
+        <w:t xml:space="preserve"> </w:t>
+      </w:r>
+      <w:r>
+        <w:t xml:space="preserve">everywhere = </w:t>
+      </w:r>
       <w:r>
         <w:t xml:space="preserve">increase or decrease </w:t>
       </w:r>

</xml_diff>